<commit_message>
minor change to Place Order UC and AD, refine and finalize SRS
</commit_message>
<xml_diff>
--- a/RequirementAnalysis/UCSpec/word/20235910_NguyenHuyDien_PlaceOrder.docx
+++ b/RequirementAnalysis/UCSpec/word/20235910_NguyenHuyDien_PlaceOrder.docx
@@ -107,8 +107,13 @@
         </w:numPr>
       </w:pPr>
       <w:r>
-        <w:t>Customer has added at least 1 product in cart</w:t>
+        <w:t xml:space="preserve">Customer has added at least 1 product </w:t>
       </w:r>
+      <w:proofErr w:type="gramStart"/>
+      <w:r>
+        <w:t>in cart</w:t>
+      </w:r>
+      <w:proofErr w:type="gramEnd"/>
       <w:r>
         <w:t>.</w:t>
       </w:r>
@@ -188,8 +193,21 @@
         <w:t>Step 12</w:t>
       </w:r>
       <w:r>
-        <w:t>. AIMS Software sends invoice and payment transaction information to customer’s email</w:t>
+        <w:t xml:space="preserve">. AIMS Software sends invoice and payment transaction information to </w:t>
       </w:r>
+      <w:proofErr w:type="gramStart"/>
+      <w:r>
+        <w:t>customer’s</w:t>
+      </w:r>
+      <w:proofErr w:type="gramEnd"/>
+      <w:r>
+        <w:t xml:space="preserve"> </w:t>
+      </w:r>
+      <w:proofErr w:type="gramStart"/>
+      <w:r>
+        <w:t>email</w:t>
+      </w:r>
+      <w:proofErr w:type="gramEnd"/>
     </w:p>
     <w:p>
       <w:r>
@@ -819,7 +837,23 @@
                 <w:sz w:val="22"/>
                 <w:szCs w:val="22"/>
               </w:rPr>
-              <w:t xml:space="preserve">AIMS Software displays cart and </w:t>
+              <w:t xml:space="preserve">AIMS Software displays </w:t>
+            </w:r>
+            <w:proofErr w:type="gramStart"/>
+            <w:r>
+              <w:rPr>
+                <w:sz w:val="22"/>
+                <w:szCs w:val="22"/>
+              </w:rPr>
+              <w:t>cart</w:t>
+            </w:r>
+            <w:proofErr w:type="gramEnd"/>
+            <w:r>
+              <w:rPr>
+                <w:sz w:val="22"/>
+                <w:szCs w:val="22"/>
+              </w:rPr>
+              <w:t xml:space="preserve"> and </w:t>
             </w:r>
             <w:r>
               <w:rPr>
@@ -1032,12 +1066,21 @@
                 <w:szCs w:val="22"/>
               </w:rPr>
             </w:pPr>
-            <w:r>
-              <w:rPr>
-                <w:sz w:val="22"/>
-                <w:szCs w:val="22"/>
-              </w:rPr>
-              <w:t>Customer exits the software</w:t>
+            <w:proofErr w:type="gramStart"/>
+            <w:r>
+              <w:rPr>
+                <w:sz w:val="22"/>
+                <w:szCs w:val="22"/>
+              </w:rPr>
+              <w:t>Customer exits</w:t>
+            </w:r>
+            <w:proofErr w:type="gramEnd"/>
+            <w:r>
+              <w:rPr>
+                <w:sz w:val="22"/>
+                <w:szCs w:val="22"/>
+              </w:rPr>
+              <w:t xml:space="preserve"> the software</w:t>
             </w:r>
             <w:r>
               <w:rPr>
@@ -1250,10 +1293,10 @@
       <w:tblGrid>
         <w:gridCol w:w="563"/>
         <w:gridCol w:w="1810"/>
-        <w:gridCol w:w="1669"/>
+        <w:gridCol w:w="1965"/>
         <w:gridCol w:w="1531"/>
-        <w:gridCol w:w="2109"/>
-        <w:gridCol w:w="1668"/>
+        <w:gridCol w:w="1831"/>
+        <w:gridCol w:w="1650"/>
       </w:tblGrid>
       <w:tr>
         <w:tc>
@@ -1304,7 +1347,7 @@
         </w:tc>
         <w:tc>
           <w:tcPr>
-            <w:tcW w:w="1669" w:type="dxa"/>
+            <w:tcW w:w="1965" w:type="dxa"/>
             <w:vAlign w:val="center"/>
           </w:tcPr>
           <w:p>
@@ -1350,7 +1393,7 @@
         </w:tc>
         <w:tc>
           <w:tcPr>
-            <w:tcW w:w="2109" w:type="dxa"/>
+            <w:tcW w:w="1831" w:type="dxa"/>
             <w:vAlign w:val="center"/>
           </w:tcPr>
           <w:p>
@@ -1373,7 +1416,7 @@
         </w:tc>
         <w:tc>
           <w:tcPr>
-            <w:tcW w:w="1668" w:type="dxa"/>
+            <w:tcW w:w="1650" w:type="dxa"/>
             <w:vAlign w:val="center"/>
           </w:tcPr>
           <w:p>
@@ -1444,18 +1487,25 @@
         </w:tc>
         <w:tc>
           <w:tcPr>
-            <w:tcW w:w="1669" w:type="dxa"/>
-            <w:vAlign w:val="center"/>
-          </w:tcPr>
-          <w:p>
-            <w:pPr>
-              <w:ind w:firstLine="0"/>
-              <w:jc w:val="left"/>
-              <w:rPr>
-                <w:sz w:val="22"/>
-                <w:szCs w:val="22"/>
-              </w:rPr>
-            </w:pPr>
+            <w:tcW w:w="1965" w:type="dxa"/>
+            <w:vAlign w:val="center"/>
+          </w:tcPr>
+          <w:p>
+            <w:pPr>
+              <w:ind w:firstLine="0"/>
+              <w:jc w:val="left"/>
+              <w:rPr>
+                <w:sz w:val="22"/>
+                <w:szCs w:val="22"/>
+              </w:rPr>
+            </w:pPr>
+            <w:r>
+              <w:rPr>
+                <w:sz w:val="22"/>
+                <w:szCs w:val="22"/>
+              </w:rPr>
+              <w:t>Name of the customer/receiver</w:t>
+            </w:r>
           </w:p>
         </w:tc>
         <w:tc>
@@ -1483,34 +1533,35 @@
         </w:tc>
         <w:tc>
           <w:tcPr>
-            <w:tcW w:w="2109" w:type="dxa"/>
-            <w:vAlign w:val="center"/>
-          </w:tcPr>
-          <w:p>
-            <w:pPr>
-              <w:ind w:firstLine="0"/>
-              <w:jc w:val="left"/>
-              <w:rPr>
-                <w:sz w:val="22"/>
-                <w:szCs w:val="22"/>
-              </w:rPr>
-            </w:pPr>
-          </w:p>
-        </w:tc>
-        <w:tc>
-          <w:tcPr>
-            <w:tcW w:w="1668" w:type="dxa"/>
-            <w:vAlign w:val="center"/>
-          </w:tcPr>
-          <w:p>
-            <w:pPr>
-              <w:ind w:firstLine="0"/>
-              <w:jc w:val="center"/>
-              <w:rPr>
-                <w:sz w:val="22"/>
-                <w:szCs w:val="22"/>
-              </w:rPr>
-            </w:pPr>
+            <w:tcW w:w="1831" w:type="dxa"/>
+            <w:vAlign w:val="center"/>
+          </w:tcPr>
+          <w:p>
+            <w:pPr>
+              <w:ind w:firstLine="0"/>
+              <w:jc w:val="left"/>
+              <w:rPr>
+                <w:sz w:val="22"/>
+                <w:szCs w:val="22"/>
+              </w:rPr>
+            </w:pPr>
+          </w:p>
+        </w:tc>
+        <w:tc>
+          <w:tcPr>
+            <w:tcW w:w="1650" w:type="dxa"/>
+            <w:vAlign w:val="center"/>
+          </w:tcPr>
+          <w:p>
+            <w:pPr>
+              <w:ind w:firstLine="0"/>
+              <w:jc w:val="center"/>
+              <w:rPr>
+                <w:sz w:val="22"/>
+                <w:szCs w:val="22"/>
+              </w:rPr>
+            </w:pPr>
+            <w:proofErr w:type="spellStart"/>
             <w:r>
               <w:rPr>
                 <w:sz w:val="22"/>
@@ -1530,7 +1581,15 @@
                 <w:sz w:val="22"/>
                 <w:szCs w:val="22"/>
               </w:rPr>
-              <w:t>n V</w:t>
+              <w:t>n</w:t>
+            </w:r>
+            <w:proofErr w:type="spellEnd"/>
+            <w:r>
+              <w:rPr>
+                <w:sz w:val="22"/>
+                <w:szCs w:val="22"/>
+              </w:rPr>
+              <w:t xml:space="preserve"> V</w:t>
             </w:r>
             <w:r>
               <w:rPr>
@@ -1598,18 +1657,25 @@
         </w:tc>
         <w:tc>
           <w:tcPr>
-            <w:tcW w:w="1669" w:type="dxa"/>
-            <w:vAlign w:val="center"/>
-          </w:tcPr>
-          <w:p>
-            <w:pPr>
-              <w:ind w:firstLine="0"/>
-              <w:jc w:val="left"/>
-              <w:rPr>
-                <w:sz w:val="22"/>
-                <w:szCs w:val="22"/>
-              </w:rPr>
-            </w:pPr>
+            <w:tcW w:w="1965" w:type="dxa"/>
+            <w:vAlign w:val="center"/>
+          </w:tcPr>
+          <w:p>
+            <w:pPr>
+              <w:ind w:firstLine="0"/>
+              <w:jc w:val="left"/>
+              <w:rPr>
+                <w:sz w:val="22"/>
+                <w:szCs w:val="22"/>
+              </w:rPr>
+            </w:pPr>
+            <w:r>
+              <w:rPr>
+                <w:sz w:val="22"/>
+                <w:szCs w:val="22"/>
+              </w:rPr>
+              <w:t>Contact number of the customer that will be used to contact the customer</w:t>
+            </w:r>
           </w:p>
         </w:tc>
         <w:tc>
@@ -1637,7 +1703,7 @@
         </w:tc>
         <w:tc>
           <w:tcPr>
-            <w:tcW w:w="2109" w:type="dxa"/>
+            <w:tcW w:w="1831" w:type="dxa"/>
             <w:vAlign w:val="center"/>
           </w:tcPr>
           <w:p>
@@ -1688,13 +1754,29 @@
                 <w:sz w:val="22"/>
                 <w:szCs w:val="22"/>
               </w:rPr>
-              <w:t>- May contain separators such as ‘-‘, ‘.’, or space in between digits</w:t>
-            </w:r>
-          </w:p>
-        </w:tc>
-        <w:tc>
-          <w:tcPr>
-            <w:tcW w:w="1668" w:type="dxa"/>
+              <w:t>- May contain separators such as ‘</w:t>
+            </w:r>
+            <w:proofErr w:type="gramStart"/>
+            <w:r>
+              <w:rPr>
+                <w:sz w:val="22"/>
+                <w:szCs w:val="22"/>
+              </w:rPr>
+              <w:t>-‘</w:t>
+            </w:r>
+            <w:proofErr w:type="gramEnd"/>
+            <w:r>
+              <w:rPr>
+                <w:sz w:val="22"/>
+                <w:szCs w:val="22"/>
+              </w:rPr>
+              <w:t>, ‘.’, or space in between digits</w:t>
+            </w:r>
+          </w:p>
+        </w:tc>
+        <w:tc>
+          <w:tcPr>
+            <w:tcW w:w="1650" w:type="dxa"/>
             <w:vAlign w:val="center"/>
           </w:tcPr>
           <w:p>
@@ -1861,30 +1943,85 @@
                 <w:sz w:val="22"/>
                 <w:szCs w:val="22"/>
               </w:rPr>
-              <w:t>(Tỉnh/Thành phố)</w:t>
-            </w:r>
-          </w:p>
-        </w:tc>
-        <w:tc>
-          <w:tcPr>
-            <w:tcW w:w="1669" w:type="dxa"/>
-            <w:vAlign w:val="center"/>
-          </w:tcPr>
-          <w:p>
-            <w:pPr>
-              <w:ind w:firstLine="0"/>
-              <w:jc w:val="left"/>
-              <w:rPr>
-                <w:sz w:val="22"/>
-                <w:szCs w:val="22"/>
-              </w:rPr>
-            </w:pPr>
-            <w:r>
-              <w:rPr>
-                <w:sz w:val="22"/>
-                <w:szCs w:val="22"/>
-              </w:rPr>
-              <w:t>Selectable from a list</w:t>
+              <w:t>(</w:t>
+            </w:r>
+            <w:proofErr w:type="spellStart"/>
+            <w:r>
+              <w:rPr>
+                <w:sz w:val="22"/>
+                <w:szCs w:val="22"/>
+              </w:rPr>
+              <w:t>Tỉnh</w:t>
+            </w:r>
+            <w:proofErr w:type="spellEnd"/>
+            <w:r>
+              <w:rPr>
+                <w:sz w:val="22"/>
+                <w:szCs w:val="22"/>
+              </w:rPr>
+              <w:t>/</w:t>
+            </w:r>
+            <w:proofErr w:type="spellStart"/>
+            <w:r>
+              <w:rPr>
+                <w:sz w:val="22"/>
+                <w:szCs w:val="22"/>
+              </w:rPr>
+              <w:t>Thành</w:t>
+            </w:r>
+            <w:proofErr w:type="spellEnd"/>
+            <w:r>
+              <w:rPr>
+                <w:sz w:val="22"/>
+                <w:szCs w:val="22"/>
+              </w:rPr>
+              <w:t xml:space="preserve"> </w:t>
+            </w:r>
+            <w:proofErr w:type="spellStart"/>
+            <w:r>
+              <w:rPr>
+                <w:sz w:val="22"/>
+                <w:szCs w:val="22"/>
+              </w:rPr>
+              <w:t>phô</w:t>
+            </w:r>
+            <w:proofErr w:type="spellEnd"/>
+            <w:r>
+              <w:rPr>
+                <w:sz w:val="22"/>
+                <w:szCs w:val="22"/>
+              </w:rPr>
+              <w:t>́)</w:t>
+            </w:r>
+          </w:p>
+        </w:tc>
+        <w:tc>
+          <w:tcPr>
+            <w:tcW w:w="1965" w:type="dxa"/>
+            <w:vAlign w:val="center"/>
+          </w:tcPr>
+          <w:p>
+            <w:pPr>
+              <w:ind w:firstLine="0"/>
+              <w:jc w:val="left"/>
+              <w:rPr>
+                <w:sz w:val="22"/>
+                <w:szCs w:val="22"/>
+              </w:rPr>
+            </w:pPr>
+            <w:r>
+              <w:rPr>
+                <w:sz w:val="22"/>
+                <w:szCs w:val="22"/>
+              </w:rPr>
+              <w:t>A province/city in Viet Nam, s</w:t>
+            </w:r>
+            <w:r>
+              <w:rPr>
+                <w:sz w:val="22"/>
+                <w:szCs w:val="22"/>
+              </w:rPr>
+              <w:t>electable from a list</w:t>
             </w:r>
           </w:p>
         </w:tc>
@@ -1913,57 +2050,75 @@
         </w:tc>
         <w:tc>
           <w:tcPr>
-            <w:tcW w:w="2109" w:type="dxa"/>
-            <w:vAlign w:val="center"/>
-          </w:tcPr>
-          <w:p>
-            <w:pPr>
-              <w:ind w:firstLine="0"/>
-              <w:jc w:val="left"/>
-              <w:rPr>
-                <w:sz w:val="22"/>
-                <w:szCs w:val="22"/>
-              </w:rPr>
-            </w:pPr>
-          </w:p>
-        </w:tc>
-        <w:tc>
-          <w:tcPr>
-            <w:tcW w:w="1668" w:type="dxa"/>
-            <w:vAlign w:val="center"/>
-          </w:tcPr>
-          <w:p>
-            <w:pPr>
-              <w:ind w:firstLine="0"/>
-              <w:jc w:val="center"/>
-              <w:rPr>
-                <w:sz w:val="22"/>
-                <w:szCs w:val="22"/>
-              </w:rPr>
-            </w:pPr>
-            <w:r>
-              <w:rPr>
-                <w:sz w:val="22"/>
-                <w:szCs w:val="22"/>
-              </w:rPr>
-              <w:t>Hà Nội</w:t>
-            </w:r>
-          </w:p>
-          <w:p>
-            <w:pPr>
-              <w:ind w:firstLine="0"/>
-              <w:jc w:val="center"/>
-              <w:rPr>
-                <w:sz w:val="22"/>
-                <w:szCs w:val="22"/>
-              </w:rPr>
-            </w:pPr>
-            <w:r>
-              <w:rPr>
-                <w:sz w:val="22"/>
-                <w:szCs w:val="22"/>
-              </w:rPr>
-              <w:t>Nghệ An</w:t>
+            <w:tcW w:w="1831" w:type="dxa"/>
+            <w:vAlign w:val="center"/>
+          </w:tcPr>
+          <w:p>
+            <w:pPr>
+              <w:ind w:firstLine="0"/>
+              <w:jc w:val="left"/>
+              <w:rPr>
+                <w:sz w:val="22"/>
+                <w:szCs w:val="22"/>
+              </w:rPr>
+            </w:pPr>
+          </w:p>
+        </w:tc>
+        <w:tc>
+          <w:tcPr>
+            <w:tcW w:w="1650" w:type="dxa"/>
+            <w:vAlign w:val="center"/>
+          </w:tcPr>
+          <w:p>
+            <w:pPr>
+              <w:ind w:firstLine="0"/>
+              <w:jc w:val="center"/>
+              <w:rPr>
+                <w:sz w:val="22"/>
+                <w:szCs w:val="22"/>
+              </w:rPr>
+            </w:pPr>
+            <w:r>
+              <w:rPr>
+                <w:sz w:val="22"/>
+                <w:szCs w:val="22"/>
+              </w:rPr>
+              <w:t xml:space="preserve">Hà </w:t>
+            </w:r>
+            <w:proofErr w:type="spellStart"/>
+            <w:r>
+              <w:rPr>
+                <w:sz w:val="22"/>
+                <w:szCs w:val="22"/>
+              </w:rPr>
+              <w:t>Nội</w:t>
+            </w:r>
+            <w:proofErr w:type="spellEnd"/>
+          </w:p>
+          <w:p>
+            <w:pPr>
+              <w:ind w:firstLine="0"/>
+              <w:jc w:val="center"/>
+              <w:rPr>
+                <w:sz w:val="22"/>
+                <w:szCs w:val="22"/>
+              </w:rPr>
+            </w:pPr>
+            <w:proofErr w:type="spellStart"/>
+            <w:r>
+              <w:rPr>
+                <w:sz w:val="22"/>
+                <w:szCs w:val="22"/>
+              </w:rPr>
+              <w:t>Nghê</w:t>
+            </w:r>
+            <w:proofErr w:type="spellEnd"/>
+            <w:r>
+              <w:rPr>
+                <w:sz w:val="22"/>
+                <w:szCs w:val="22"/>
+              </w:rPr>
+              <w:t>̣ An</w:t>
             </w:r>
           </w:p>
           <w:p>
@@ -2005,6 +2160,7 @@
                 <w:sz w:val="22"/>
                 <w:szCs w:val="22"/>
               </w:rPr>
+              <w:lastRenderedPageBreak/>
               <w:t>4</w:t>
             </w:r>
           </w:p>
@@ -2045,30 +2201,69 @@
                 <w:sz w:val="22"/>
                 <w:szCs w:val="22"/>
               </w:rPr>
-              <w:t>(Phường/Xã)</w:t>
-            </w:r>
-          </w:p>
-        </w:tc>
-        <w:tc>
-          <w:tcPr>
-            <w:tcW w:w="1669" w:type="dxa"/>
-            <w:vAlign w:val="center"/>
-          </w:tcPr>
-          <w:p>
-            <w:pPr>
-              <w:ind w:firstLine="0"/>
-              <w:jc w:val="left"/>
-              <w:rPr>
-                <w:sz w:val="22"/>
-                <w:szCs w:val="22"/>
-              </w:rPr>
-            </w:pPr>
-            <w:r>
-              <w:rPr>
-                <w:sz w:val="22"/>
-                <w:szCs w:val="22"/>
-              </w:rPr>
-              <w:t>Selectable from a list</w:t>
+              <w:t>(</w:t>
+            </w:r>
+            <w:proofErr w:type="spellStart"/>
+            <w:r>
+              <w:rPr>
+                <w:sz w:val="22"/>
+                <w:szCs w:val="22"/>
+              </w:rPr>
+              <w:t>Phường</w:t>
+            </w:r>
+            <w:proofErr w:type="spellEnd"/>
+            <w:r>
+              <w:rPr>
+                <w:sz w:val="22"/>
+                <w:szCs w:val="22"/>
+              </w:rPr>
+              <w:t>/Xã)</w:t>
+            </w:r>
+          </w:p>
+        </w:tc>
+        <w:tc>
+          <w:tcPr>
+            <w:tcW w:w="1965" w:type="dxa"/>
+            <w:vAlign w:val="center"/>
+          </w:tcPr>
+          <w:p>
+            <w:pPr>
+              <w:ind w:firstLine="0"/>
+              <w:jc w:val="left"/>
+              <w:rPr>
+                <w:sz w:val="22"/>
+                <w:szCs w:val="22"/>
+              </w:rPr>
+            </w:pPr>
+            <w:r>
+              <w:rPr>
+                <w:sz w:val="22"/>
+                <w:szCs w:val="22"/>
+              </w:rPr>
+              <w:t xml:space="preserve">A </w:t>
+            </w:r>
+            <w:proofErr w:type="gramStart"/>
+            <w:r>
+              <w:rPr>
+                <w:sz w:val="22"/>
+                <w:szCs w:val="22"/>
+              </w:rPr>
+              <w:t>ward</w:t>
+            </w:r>
+            <w:proofErr w:type="gramEnd"/>
+            <w:r>
+              <w:rPr>
+                <w:sz w:val="22"/>
+                <w:szCs w:val="22"/>
+              </w:rPr>
+              <w:t>/commune in that province/city, s</w:t>
+            </w:r>
+            <w:r>
+              <w:rPr>
+                <w:sz w:val="22"/>
+                <w:szCs w:val="22"/>
+              </w:rPr>
+              <w:t>electable from a list</w:t>
             </w:r>
           </w:p>
         </w:tc>
@@ -2097,58 +2292,76 @@
         </w:tc>
         <w:tc>
           <w:tcPr>
-            <w:tcW w:w="2109" w:type="dxa"/>
-            <w:vAlign w:val="center"/>
-          </w:tcPr>
-          <w:p>
-            <w:pPr>
-              <w:ind w:firstLine="0"/>
-              <w:jc w:val="left"/>
-              <w:rPr>
-                <w:sz w:val="22"/>
-                <w:szCs w:val="22"/>
-              </w:rPr>
-            </w:pPr>
-          </w:p>
-        </w:tc>
-        <w:tc>
-          <w:tcPr>
-            <w:tcW w:w="1668" w:type="dxa"/>
-            <w:vAlign w:val="center"/>
-          </w:tcPr>
-          <w:p>
-            <w:pPr>
-              <w:ind w:firstLine="0"/>
-              <w:jc w:val="center"/>
-              <w:rPr>
-                <w:sz w:val="22"/>
-                <w:szCs w:val="22"/>
-              </w:rPr>
-            </w:pPr>
-            <w:r>
-              <w:rPr>
-                <w:sz w:val="22"/>
-                <w:szCs w:val="22"/>
-              </w:rPr>
-              <w:t>Phường Hà Đông</w:t>
-            </w:r>
-          </w:p>
-          <w:p>
-            <w:pPr>
-              <w:ind w:firstLine="0"/>
-              <w:jc w:val="center"/>
-              <w:rPr>
-                <w:sz w:val="22"/>
-                <w:szCs w:val="22"/>
-              </w:rPr>
-            </w:pPr>
-            <w:r>
-              <w:rPr>
-                <w:sz w:val="22"/>
-                <w:szCs w:val="22"/>
-              </w:rPr>
-              <w:t>Xã An Khánh</w:t>
-            </w:r>
+            <w:tcW w:w="1831" w:type="dxa"/>
+            <w:vAlign w:val="center"/>
+          </w:tcPr>
+          <w:p>
+            <w:pPr>
+              <w:ind w:firstLine="0"/>
+              <w:jc w:val="left"/>
+              <w:rPr>
+                <w:sz w:val="22"/>
+                <w:szCs w:val="22"/>
+              </w:rPr>
+            </w:pPr>
+          </w:p>
+        </w:tc>
+        <w:tc>
+          <w:tcPr>
+            <w:tcW w:w="1650" w:type="dxa"/>
+            <w:vAlign w:val="center"/>
+          </w:tcPr>
+          <w:p>
+            <w:pPr>
+              <w:ind w:firstLine="0"/>
+              <w:jc w:val="center"/>
+              <w:rPr>
+                <w:sz w:val="22"/>
+                <w:szCs w:val="22"/>
+              </w:rPr>
+            </w:pPr>
+            <w:proofErr w:type="spellStart"/>
+            <w:r>
+              <w:rPr>
+                <w:sz w:val="22"/>
+                <w:szCs w:val="22"/>
+              </w:rPr>
+              <w:t>Phường</w:t>
+            </w:r>
+            <w:proofErr w:type="spellEnd"/>
+            <w:r>
+              <w:rPr>
+                <w:sz w:val="22"/>
+                <w:szCs w:val="22"/>
+              </w:rPr>
+              <w:t xml:space="preserve"> Hà Đông</w:t>
+            </w:r>
+          </w:p>
+          <w:p>
+            <w:pPr>
+              <w:ind w:firstLine="0"/>
+              <w:jc w:val="center"/>
+              <w:rPr>
+                <w:sz w:val="22"/>
+                <w:szCs w:val="22"/>
+              </w:rPr>
+            </w:pPr>
+            <w:r>
+              <w:rPr>
+                <w:sz w:val="22"/>
+                <w:szCs w:val="22"/>
+              </w:rPr>
+              <w:t xml:space="preserve">Xã An </w:t>
+            </w:r>
+            <w:proofErr w:type="spellStart"/>
+            <w:r>
+              <w:rPr>
+                <w:sz w:val="22"/>
+                <w:szCs w:val="22"/>
+              </w:rPr>
+              <w:t>Khánh</w:t>
+            </w:r>
+            <w:proofErr w:type="spellEnd"/>
           </w:p>
           <w:p>
             <w:pPr>
@@ -2189,7 +2402,6 @@
                 <w:sz w:val="22"/>
                 <w:szCs w:val="22"/>
               </w:rPr>
-              <w:lastRenderedPageBreak/>
               <w:t>5</w:t>
             </w:r>
           </w:p>
@@ -2219,18 +2431,25 @@
         </w:tc>
         <w:tc>
           <w:tcPr>
-            <w:tcW w:w="1669" w:type="dxa"/>
-            <w:vAlign w:val="center"/>
-          </w:tcPr>
-          <w:p>
-            <w:pPr>
-              <w:ind w:firstLine="0"/>
-              <w:jc w:val="left"/>
-              <w:rPr>
-                <w:sz w:val="22"/>
-                <w:szCs w:val="22"/>
-              </w:rPr>
-            </w:pPr>
+            <w:tcW w:w="1965" w:type="dxa"/>
+            <w:vAlign w:val="center"/>
+          </w:tcPr>
+          <w:p>
+            <w:pPr>
+              <w:ind w:firstLine="0"/>
+              <w:jc w:val="left"/>
+              <w:rPr>
+                <w:sz w:val="22"/>
+                <w:szCs w:val="22"/>
+              </w:rPr>
+            </w:pPr>
+            <w:r>
+              <w:rPr>
+                <w:sz w:val="22"/>
+                <w:szCs w:val="22"/>
+              </w:rPr>
+              <w:t>Detailed address of the customer attached to</w:t>
+            </w:r>
           </w:p>
         </w:tc>
         <w:tc>
@@ -2258,41 +2477,82 @@
         </w:tc>
         <w:tc>
           <w:tcPr>
-            <w:tcW w:w="2109" w:type="dxa"/>
-            <w:vAlign w:val="center"/>
-          </w:tcPr>
-          <w:p>
-            <w:pPr>
-              <w:ind w:firstLine="0"/>
-              <w:jc w:val="left"/>
-              <w:rPr>
-                <w:sz w:val="22"/>
-                <w:szCs w:val="22"/>
-              </w:rPr>
-            </w:pPr>
-          </w:p>
-        </w:tc>
-        <w:tc>
-          <w:tcPr>
-            <w:tcW w:w="1668" w:type="dxa"/>
-            <w:vAlign w:val="center"/>
-          </w:tcPr>
-          <w:p>
-            <w:pPr>
-              <w:ind w:firstLine="0"/>
-              <w:jc w:val="center"/>
-              <w:rPr>
-                <w:sz w:val="22"/>
-                <w:szCs w:val="22"/>
-              </w:rPr>
-            </w:pPr>
-            <w:r>
-              <w:rPr>
-                <w:sz w:val="22"/>
-                <w:szCs w:val="22"/>
-              </w:rPr>
-              <w:t>199 Chiến Thắng, Triều Khúc</w:t>
-            </w:r>
+            <w:tcW w:w="1831" w:type="dxa"/>
+            <w:vAlign w:val="center"/>
+          </w:tcPr>
+          <w:p>
+            <w:pPr>
+              <w:ind w:firstLine="0"/>
+              <w:jc w:val="left"/>
+              <w:rPr>
+                <w:sz w:val="22"/>
+                <w:szCs w:val="22"/>
+              </w:rPr>
+            </w:pPr>
+          </w:p>
+        </w:tc>
+        <w:tc>
+          <w:tcPr>
+            <w:tcW w:w="1650" w:type="dxa"/>
+            <w:vAlign w:val="center"/>
+          </w:tcPr>
+          <w:p>
+            <w:pPr>
+              <w:ind w:firstLine="0"/>
+              <w:jc w:val="center"/>
+              <w:rPr>
+                <w:sz w:val="22"/>
+                <w:szCs w:val="22"/>
+              </w:rPr>
+            </w:pPr>
+            <w:r>
+              <w:rPr>
+                <w:sz w:val="22"/>
+                <w:szCs w:val="22"/>
+              </w:rPr>
+              <w:t xml:space="preserve">199 </w:t>
+            </w:r>
+            <w:proofErr w:type="spellStart"/>
+            <w:r>
+              <w:rPr>
+                <w:sz w:val="22"/>
+                <w:szCs w:val="22"/>
+              </w:rPr>
+              <w:t>Chiến</w:t>
+            </w:r>
+            <w:proofErr w:type="spellEnd"/>
+            <w:r>
+              <w:rPr>
+                <w:sz w:val="22"/>
+                <w:szCs w:val="22"/>
+              </w:rPr>
+              <w:t xml:space="preserve"> Thắng, </w:t>
+            </w:r>
+            <w:proofErr w:type="spellStart"/>
+            <w:r>
+              <w:rPr>
+                <w:sz w:val="22"/>
+                <w:szCs w:val="22"/>
+              </w:rPr>
+              <w:t>Triều</w:t>
+            </w:r>
+            <w:proofErr w:type="spellEnd"/>
+            <w:r>
+              <w:rPr>
+                <w:sz w:val="22"/>
+                <w:szCs w:val="22"/>
+              </w:rPr>
+              <w:t xml:space="preserve"> </w:t>
+            </w:r>
+            <w:proofErr w:type="spellStart"/>
+            <w:r>
+              <w:rPr>
+                <w:sz w:val="22"/>
+                <w:szCs w:val="22"/>
+              </w:rPr>
+              <w:t>Khúc</w:t>
+            </w:r>
+            <w:proofErr w:type="spellEnd"/>
           </w:p>
         </w:tc>
       </w:tr>
@@ -2339,24 +2599,31 @@
                 <w:sz w:val="22"/>
                 <w:szCs w:val="22"/>
               </w:rPr>
-              <w:t>Delivery instructions</w:t>
-            </w:r>
-          </w:p>
-        </w:tc>
-        <w:tc>
-          <w:tcPr>
-            <w:tcW w:w="1669" w:type="dxa"/>
-            <w:vAlign w:val="center"/>
-          </w:tcPr>
-          <w:p>
-            <w:pPr>
-              <w:ind w:firstLine="0"/>
-              <w:jc w:val="left"/>
-              <w:rPr>
-                <w:sz w:val="22"/>
-                <w:szCs w:val="22"/>
-              </w:rPr>
-            </w:pPr>
+              <w:t>Delivery method</w:t>
+            </w:r>
+          </w:p>
+        </w:tc>
+        <w:tc>
+          <w:tcPr>
+            <w:tcW w:w="1965" w:type="dxa"/>
+            <w:vAlign w:val="center"/>
+          </w:tcPr>
+          <w:p>
+            <w:pPr>
+              <w:ind w:firstLine="0"/>
+              <w:jc w:val="left"/>
+              <w:rPr>
+                <w:sz w:val="22"/>
+                <w:szCs w:val="22"/>
+              </w:rPr>
+            </w:pPr>
+            <w:r>
+              <w:rPr>
+                <w:sz w:val="22"/>
+                <w:szCs w:val="22"/>
+              </w:rPr>
+              <w:t>How the products should be delivered to the customer</w:t>
+            </w:r>
           </w:p>
         </w:tc>
         <w:tc>
@@ -2378,40 +2645,81 @@
                 <w:sz w:val="22"/>
                 <w:szCs w:val="22"/>
               </w:rPr>
-              <w:t>No</w:t>
-            </w:r>
-          </w:p>
-        </w:tc>
-        <w:tc>
-          <w:tcPr>
-            <w:tcW w:w="2109" w:type="dxa"/>
-            <w:vAlign w:val="center"/>
-          </w:tcPr>
-          <w:p>
-            <w:pPr>
-              <w:ind w:firstLine="0"/>
-              <w:jc w:val="left"/>
-              <w:rPr>
-                <w:sz w:val="22"/>
-                <w:szCs w:val="22"/>
-              </w:rPr>
-            </w:pPr>
-          </w:p>
-        </w:tc>
-        <w:tc>
-          <w:tcPr>
-            <w:tcW w:w="1668" w:type="dxa"/>
-            <w:vAlign w:val="center"/>
-          </w:tcPr>
-          <w:p>
-            <w:pPr>
-              <w:ind w:firstLine="0"/>
-              <w:jc w:val="center"/>
-              <w:rPr>
-                <w:sz w:val="22"/>
-                <w:szCs w:val="22"/>
-              </w:rPr>
-            </w:pPr>
+              <w:t>Yes</w:t>
+            </w:r>
+          </w:p>
+        </w:tc>
+        <w:tc>
+          <w:tcPr>
+            <w:tcW w:w="1831" w:type="dxa"/>
+            <w:vAlign w:val="center"/>
+          </w:tcPr>
+          <w:p>
+            <w:pPr>
+              <w:ind w:firstLine="0"/>
+              <w:jc w:val="left"/>
+              <w:rPr>
+                <w:sz w:val="22"/>
+                <w:szCs w:val="22"/>
+              </w:rPr>
+            </w:pPr>
+          </w:p>
+        </w:tc>
+        <w:tc>
+          <w:tcPr>
+            <w:tcW w:w="1650" w:type="dxa"/>
+            <w:vAlign w:val="center"/>
+          </w:tcPr>
+          <w:p>
+            <w:pPr>
+              <w:ind w:firstLine="0"/>
+              <w:jc w:val="center"/>
+              <w:rPr>
+                <w:sz w:val="22"/>
+                <w:szCs w:val="22"/>
+              </w:rPr>
+            </w:pPr>
+            <w:r>
+              <w:rPr>
+                <w:sz w:val="22"/>
+                <w:szCs w:val="22"/>
+              </w:rPr>
+              <w:t>Quick,</w:t>
+            </w:r>
+          </w:p>
+          <w:p>
+            <w:pPr>
+              <w:ind w:firstLine="0"/>
+              <w:jc w:val="center"/>
+              <w:rPr>
+                <w:sz w:val="22"/>
+                <w:szCs w:val="22"/>
+              </w:rPr>
+            </w:pPr>
+            <w:r>
+              <w:rPr>
+                <w:sz w:val="22"/>
+                <w:szCs w:val="22"/>
+              </w:rPr>
+              <w:t>Normal (default),</w:t>
+            </w:r>
+          </w:p>
+          <w:p>
+            <w:pPr>
+              <w:ind w:firstLine="0"/>
+              <w:jc w:val="center"/>
+              <w:rPr>
+                <w:sz w:val="22"/>
+                <w:szCs w:val="22"/>
+              </w:rPr>
+            </w:pPr>
+            <w:r>
+              <w:rPr>
+                <w:sz w:val="22"/>
+                <w:szCs w:val="22"/>
+              </w:rPr>
+              <w:t>…</w:t>
+            </w:r>
           </w:p>
         </w:tc>
       </w:tr>
@@ -2825,7 +3133,23 @@
                 <w:sz w:val="22"/>
                 <w:szCs w:val="22"/>
               </w:rPr>
-              <w:t>The number of the corresponding product to be purchased</w:t>
+              <w:t xml:space="preserve">The number of the corresponding </w:t>
+            </w:r>
+            <w:proofErr w:type="gramStart"/>
+            <w:r>
+              <w:rPr>
+                <w:sz w:val="22"/>
+                <w:szCs w:val="22"/>
+              </w:rPr>
+              <w:t>product</w:t>
+            </w:r>
+            <w:proofErr w:type="gramEnd"/>
+            <w:r>
+              <w:rPr>
+                <w:sz w:val="22"/>
+                <w:szCs w:val="22"/>
+              </w:rPr>
+              <w:t xml:space="preserve"> to be purchased</w:t>
             </w:r>
           </w:p>
         </w:tc>
@@ -3914,6 +4238,7 @@
                 <w:szCs w:val="22"/>
               </w:rPr>
             </w:pPr>
+            <w:proofErr w:type="spellStart"/>
             <w:r>
               <w:rPr>
                 <w:sz w:val="22"/>
@@ -3933,7 +4258,15 @@
                 <w:sz w:val="22"/>
                 <w:szCs w:val="22"/>
               </w:rPr>
-              <w:t>n V</w:t>
+              <w:t>n</w:t>
+            </w:r>
+            <w:proofErr w:type="spellEnd"/>
+            <w:r>
+              <w:rPr>
+                <w:sz w:val="22"/>
+                <w:szCs w:val="22"/>
+              </w:rPr>
+              <w:t xml:space="preserve"> V</w:t>
             </w:r>
             <w:r>
               <w:rPr>
@@ -3972,6 +4305,7 @@
                 <w:sz w:val="22"/>
                 <w:szCs w:val="22"/>
               </w:rPr>
+              <w:lastRenderedPageBreak/>
               <w:t>2</w:t>
             </w:r>
           </w:p>
@@ -4034,7 +4368,23 @@
                 <w:sz w:val="22"/>
                 <w:szCs w:val="22"/>
               </w:rPr>
-              <w:t>10 digits starting with 0 with ‘.’, ‘-‘, or space</w:t>
+              <w:t>10 digits starting with 0 with ‘.</w:t>
+            </w:r>
+            <w:proofErr w:type="gramStart"/>
+            <w:r>
+              <w:rPr>
+                <w:sz w:val="22"/>
+                <w:szCs w:val="22"/>
+              </w:rPr>
+              <w:t>’, ‘-‘</w:t>
+            </w:r>
+            <w:proofErr w:type="gramEnd"/>
+            <w:r>
+              <w:rPr>
+                <w:sz w:val="22"/>
+                <w:szCs w:val="22"/>
+              </w:rPr>
+              <w:t>, or space</w:t>
             </w:r>
           </w:p>
         </w:tc>
@@ -4207,7 +4557,55 @@
                 <w:sz w:val="22"/>
                 <w:szCs w:val="22"/>
               </w:rPr>
-              <w:t>(Tỉnh/Thành phố)</w:t>
+              <w:t>(</w:t>
+            </w:r>
+            <w:proofErr w:type="spellStart"/>
+            <w:r>
+              <w:rPr>
+                <w:sz w:val="22"/>
+                <w:szCs w:val="22"/>
+              </w:rPr>
+              <w:t>Tỉnh</w:t>
+            </w:r>
+            <w:proofErr w:type="spellEnd"/>
+            <w:r>
+              <w:rPr>
+                <w:sz w:val="22"/>
+                <w:szCs w:val="22"/>
+              </w:rPr>
+              <w:t>/</w:t>
+            </w:r>
+            <w:proofErr w:type="spellStart"/>
+            <w:r>
+              <w:rPr>
+                <w:sz w:val="22"/>
+                <w:szCs w:val="22"/>
+              </w:rPr>
+              <w:t>Thành</w:t>
+            </w:r>
+            <w:proofErr w:type="spellEnd"/>
+            <w:r>
+              <w:rPr>
+                <w:sz w:val="22"/>
+                <w:szCs w:val="22"/>
+              </w:rPr>
+              <w:t xml:space="preserve"> </w:t>
+            </w:r>
+            <w:proofErr w:type="spellStart"/>
+            <w:r>
+              <w:rPr>
+                <w:sz w:val="22"/>
+                <w:szCs w:val="22"/>
+              </w:rPr>
+              <w:t>phô</w:t>
+            </w:r>
+            <w:proofErr w:type="spellEnd"/>
+            <w:r>
+              <w:rPr>
+                <w:sz w:val="22"/>
+                <w:szCs w:val="22"/>
+              </w:rPr>
+              <w:t>́)</w:t>
             </w:r>
           </w:p>
         </w:tc>
@@ -4262,24 +4660,42 @@
                 <w:sz w:val="22"/>
                 <w:szCs w:val="22"/>
               </w:rPr>
-              <w:t>Hà Nội</w:t>
-            </w:r>
-          </w:p>
-          <w:p>
-            <w:pPr>
-              <w:ind w:firstLine="0"/>
-              <w:jc w:val="left"/>
-              <w:rPr>
-                <w:sz w:val="22"/>
-                <w:szCs w:val="22"/>
-              </w:rPr>
-            </w:pPr>
-            <w:r>
-              <w:rPr>
-                <w:sz w:val="22"/>
-                <w:szCs w:val="22"/>
-              </w:rPr>
-              <w:t>Nghệ An</w:t>
+              <w:t xml:space="preserve">Hà </w:t>
+            </w:r>
+            <w:proofErr w:type="spellStart"/>
+            <w:r>
+              <w:rPr>
+                <w:sz w:val="22"/>
+                <w:szCs w:val="22"/>
+              </w:rPr>
+              <w:t>Nội</w:t>
+            </w:r>
+            <w:proofErr w:type="spellEnd"/>
+          </w:p>
+          <w:p>
+            <w:pPr>
+              <w:ind w:firstLine="0"/>
+              <w:jc w:val="left"/>
+              <w:rPr>
+                <w:sz w:val="22"/>
+                <w:szCs w:val="22"/>
+              </w:rPr>
+            </w:pPr>
+            <w:proofErr w:type="spellStart"/>
+            <w:r>
+              <w:rPr>
+                <w:sz w:val="22"/>
+                <w:szCs w:val="22"/>
+              </w:rPr>
+              <w:t>Nghê</w:t>
+            </w:r>
+            <w:proofErr w:type="spellEnd"/>
+            <w:r>
+              <w:rPr>
+                <w:sz w:val="22"/>
+                <w:szCs w:val="22"/>
+              </w:rPr>
+              <w:t>̣ An</w:t>
             </w:r>
           </w:p>
           <w:p>
@@ -4321,7 +4737,6 @@
                 <w:sz w:val="22"/>
                 <w:szCs w:val="22"/>
               </w:rPr>
-              <w:lastRenderedPageBreak/>
               <w:t>4</w:t>
             </w:r>
           </w:p>
@@ -4362,7 +4777,23 @@
                 <w:sz w:val="22"/>
                 <w:szCs w:val="22"/>
               </w:rPr>
-              <w:t>(Phường/Xã)</w:t>
+              <w:t>(</w:t>
+            </w:r>
+            <w:proofErr w:type="spellStart"/>
+            <w:r>
+              <w:rPr>
+                <w:sz w:val="22"/>
+                <w:szCs w:val="22"/>
+              </w:rPr>
+              <w:t>Phường</w:t>
+            </w:r>
+            <w:proofErr w:type="spellEnd"/>
+            <w:r>
+              <w:rPr>
+                <w:sz w:val="22"/>
+                <w:szCs w:val="22"/>
+              </w:rPr>
+              <w:t>/Xã)</w:t>
             </w:r>
           </w:p>
         </w:tc>
@@ -4412,30 +4843,48 @@
                 <w:szCs w:val="22"/>
               </w:rPr>
             </w:pPr>
-            <w:r>
-              <w:rPr>
-                <w:sz w:val="22"/>
-                <w:szCs w:val="22"/>
-              </w:rPr>
-              <w:t>Phường Hà Đông</w:t>
-            </w:r>
-          </w:p>
-          <w:p>
-            <w:pPr>
-              <w:ind w:firstLine="0"/>
-              <w:jc w:val="left"/>
-              <w:rPr>
-                <w:sz w:val="22"/>
-                <w:szCs w:val="22"/>
-              </w:rPr>
-            </w:pPr>
-            <w:r>
-              <w:rPr>
-                <w:sz w:val="22"/>
-                <w:szCs w:val="22"/>
-              </w:rPr>
-              <w:t>Xã An Khánh</w:t>
-            </w:r>
+            <w:proofErr w:type="spellStart"/>
+            <w:r>
+              <w:rPr>
+                <w:sz w:val="22"/>
+                <w:szCs w:val="22"/>
+              </w:rPr>
+              <w:t>Phường</w:t>
+            </w:r>
+            <w:proofErr w:type="spellEnd"/>
+            <w:r>
+              <w:rPr>
+                <w:sz w:val="22"/>
+                <w:szCs w:val="22"/>
+              </w:rPr>
+              <w:t xml:space="preserve"> Hà Đông</w:t>
+            </w:r>
+          </w:p>
+          <w:p>
+            <w:pPr>
+              <w:ind w:firstLine="0"/>
+              <w:jc w:val="left"/>
+              <w:rPr>
+                <w:sz w:val="22"/>
+                <w:szCs w:val="22"/>
+              </w:rPr>
+            </w:pPr>
+            <w:r>
+              <w:rPr>
+                <w:sz w:val="22"/>
+                <w:szCs w:val="22"/>
+              </w:rPr>
+              <w:t xml:space="preserve">Xã An </w:t>
+            </w:r>
+            <w:proofErr w:type="spellStart"/>
+            <w:r>
+              <w:rPr>
+                <w:sz w:val="22"/>
+                <w:szCs w:val="22"/>
+              </w:rPr>
+              <w:t>Khánh</w:t>
+            </w:r>
+            <w:proofErr w:type="spellEnd"/>
           </w:p>
           <w:p>
             <w:pPr>
@@ -4554,8 +5003,49 @@
                 <w:sz w:val="22"/>
                 <w:szCs w:val="22"/>
               </w:rPr>
-              <w:t>199 Chiến Thắng, Triều Khúc</w:t>
-            </w:r>
+              <w:t xml:space="preserve">199 </w:t>
+            </w:r>
+            <w:proofErr w:type="spellStart"/>
+            <w:r>
+              <w:rPr>
+                <w:sz w:val="22"/>
+                <w:szCs w:val="22"/>
+              </w:rPr>
+              <w:t>Chiến</w:t>
+            </w:r>
+            <w:proofErr w:type="spellEnd"/>
+            <w:r>
+              <w:rPr>
+                <w:sz w:val="22"/>
+                <w:szCs w:val="22"/>
+              </w:rPr>
+              <w:t xml:space="preserve"> Thắng, </w:t>
+            </w:r>
+            <w:proofErr w:type="spellStart"/>
+            <w:r>
+              <w:rPr>
+                <w:sz w:val="22"/>
+                <w:szCs w:val="22"/>
+              </w:rPr>
+              <w:t>Triều</w:t>
+            </w:r>
+            <w:proofErr w:type="spellEnd"/>
+            <w:r>
+              <w:rPr>
+                <w:sz w:val="22"/>
+                <w:szCs w:val="22"/>
+              </w:rPr>
+              <w:t xml:space="preserve"> </w:t>
+            </w:r>
+            <w:proofErr w:type="spellStart"/>
+            <w:r>
+              <w:rPr>
+                <w:sz w:val="22"/>
+                <w:szCs w:val="22"/>
+              </w:rPr>
+              <w:t>Khúc</w:t>
+            </w:r>
+            <w:proofErr w:type="spellEnd"/>
           </w:p>
         </w:tc>
       </w:tr>
@@ -5211,8 +5701,17 @@
                 <w:sz w:val="22"/>
                 <w:szCs w:val="22"/>
               </w:rPr>
-              <w:t>dd/mm/yyyy</w:t>
-            </w:r>
+              <w:t>dd/mm/</w:t>
+            </w:r>
+            <w:proofErr w:type="spellStart"/>
+            <w:r>
+              <w:rPr>
+                <w:sz w:val="22"/>
+                <w:szCs w:val="22"/>
+              </w:rPr>
+              <w:t>yyyy</w:t>
+            </w:r>
+            <w:proofErr w:type="spellEnd"/>
           </w:p>
         </w:tc>
         <w:tc>
@@ -5285,7 +5784,15 @@
         </w:numPr>
       </w:pPr>
       <w:r>
-        <w:t>A new order is created in the system and its status is set to Pending.</w:t>
+        <w:t xml:space="preserve">A new order is created in the </w:t>
+      </w:r>
+      <w:proofErr w:type="gramStart"/>
+      <w:r>
+        <w:t>system</w:t>
+      </w:r>
+      <w:proofErr w:type="gramEnd"/>
+      <w:r>
+        <w:t xml:space="preserve"> and its status is set to Pending.</w:t>
       </w:r>
     </w:p>
     <w:p>
@@ -5314,8 +5821,21 @@
           <w:numId w:val="2"/>
         </w:numPr>
       </w:pPr>
+      <w:proofErr w:type="gramStart"/>
       <w:r>
-        <w:t>Customer receives email containing invoice and payment transaction information</w:t>
+        <w:t>Customer receives</w:t>
+      </w:r>
+      <w:proofErr w:type="gramEnd"/>
+      <w:r>
+        <w:t xml:space="preserve"> email containing </w:t>
+      </w:r>
+      <w:proofErr w:type="gramStart"/>
+      <w:r>
+        <w:t>invoice</w:t>
+      </w:r>
+      <w:proofErr w:type="gramEnd"/>
+      <w:r>
+        <w:t xml:space="preserve"> and payment transaction information</w:t>
       </w:r>
     </w:p>
     <w:p>

</xml_diff>